<commit_message>
fix: synchronize standalone app.js and styles.css with index.html to restore missing Parts, Transactions, and Users logic; include visual diagrams in user manual
</commit_message>
<xml_diff>
--- a/user_manual.docx
+++ b/user_manual.docx
@@ -898,6 +898,57 @@
         <w:t>🔴 บันทึกข้อมูลล้มเหลว (Danger - ขอบแดงนีออน): เกิดข้อผิดพลาดของข้อมูล หรือตรวจสอบสิทธิ์ล้มเหลว ทำให้ไม่สามารถบันทึกธุรกรรมลงในระบบคลังได้เลย</w:t>
       </w:r>
     </w:p>
+    <w:p/>
+    <w:p>
+      <w:r>
+        <w:drawing>
+          <wp:inline xmlns:a="http://schemas.openxmlformats.org/drawingml/2006/main" xmlns:pic="http://schemas.openxmlformats.org/drawingml/2006/picture">
+            <wp:extent cx="4114800" cy="2490537"/>
+            <wp:docPr id="1" name="Picture 1"/>
+            <wp:cNvGraphicFramePr>
+              <a:graphicFrameLocks noChangeAspect="1"/>
+            </wp:cNvGraphicFramePr>
+            <a:graphic>
+              <a:graphicData uri="http://schemas.openxmlformats.org/drawingml/2006/picture">
+                <pic:pic>
+                  <pic:nvPicPr>
+                    <pic:cNvPr id="0" name="success_modal.png"/>
+                    <pic:cNvPicPr/>
+                  </pic:nvPicPr>
+                  <pic:blipFill>
+                    <a:blip r:embed="rId9"/>
+                    <a:stretch>
+                      <a:fillRect/>
+                    </a:stretch>
+                  </pic:blipFill>
+                  <pic:spPr>
+                    <a:xfrm>
+                      <a:off x="0" y="0"/>
+                      <a:ext cx="4114800" cy="2490537"/>
+                    </a:xfrm>
+                    <a:prstGeom prst="rect"/>
+                  </pic:spPr>
+                </pic:pic>
+              </a:graphicData>
+            </a:graphic>
+          </wp:inline>
+        </w:drawing>
+      </w:r>
+    </w:p>
+    <w:p>
+      <w:pPr>
+        <w:jc w:val="center"/>
+      </w:pPr>
+      <w:r>
+        <w:rPr>
+          <w:i/>
+          <w:color w:val="505050"/>
+          <w:sz w:val="18"/>
+        </w:rPr>
+        <w:t>รูปภาพ: หน้าต่างข้อความเตือนแก้วโปร่งแสง (Glassmorphic Modal Popup)</w:t>
+      </w:r>
+    </w:p>
+    <w:p/>
     <w:p>
       <w:pPr>
         <w:pStyle w:val="Heading3"/>
@@ -1077,6 +1128,57 @@
         <w:t>กดเปิดใช้งานสวิตช์ Use Webhook 🟢</w:t>
       </w:r>
     </w:p>
+    <w:p/>
+    <w:p>
+      <w:r>
+        <w:drawing>
+          <wp:inline xmlns:a="http://schemas.openxmlformats.org/drawingml/2006/main" xmlns:pic="http://schemas.openxmlformats.org/drawingml/2006/picture">
+            <wp:extent cx="4114800" cy="996553"/>
+            <wp:docPr id="2" name="Picture 2"/>
+            <wp:cNvGraphicFramePr>
+              <a:graphicFrameLocks noChangeAspect="1"/>
+            </wp:cNvGraphicFramePr>
+            <a:graphic>
+              <a:graphicData uri="http://schemas.openxmlformats.org/drawingml/2006/picture">
+                <pic:pic>
+                  <pic:nvPicPr>
+                    <pic:cNvPr id="0" name="webhook_verify.png"/>
+                    <pic:cNvPicPr/>
+                  </pic:nvPicPr>
+                  <pic:blipFill>
+                    <a:blip r:embed="rId10"/>
+                    <a:stretch>
+                      <a:fillRect/>
+                    </a:stretch>
+                  </pic:blipFill>
+                  <pic:spPr>
+                    <a:xfrm>
+                      <a:off x="0" y="0"/>
+                      <a:ext cx="4114800" cy="996553"/>
+                    </a:xfrm>
+                    <a:prstGeom prst="rect"/>
+                  </pic:spPr>
+                </pic:pic>
+              </a:graphicData>
+            </a:graphic>
+          </wp:inline>
+        </w:drawing>
+      </w:r>
+    </w:p>
+    <w:p>
+      <w:pPr>
+        <w:jc w:val="center"/>
+      </w:pPr>
+      <w:r>
+        <w:rPr>
+          <w:i/>
+          <w:color w:val="505050"/>
+          <w:sz w:val="18"/>
+        </w:rPr>
+        <w:t>รูปภาพ: การเชื่อมต่อและเปิดใช้ระบบ Webhook ใน LINE Developers Console</w:t>
+      </w:r>
+    </w:p>
+    <w:p/>
     <w:p>
       <w:r>
         <w:t>2. วิธีการหา ID จาก Google Sheets:</w:t>
@@ -1114,6 +1216,57 @@
         <w:t>เปิด Google Sheets ไปที่ชีต `LINE_IDs` แล้วก๊อปปี้ค่า ID ที่ขึ้นต้นด้วย `U...` (สำหรับผู้ใช้เดี่ยว) หรือ `C...` (สำหรับกลุ่มแชต) มาวางลงในช่อง "LINE Group ID / User ID" ในหน้าตั้งค่าแอปพลิเคชัน แล้วกดยืนยันบันทึก</w:t>
       </w:r>
     </w:p>
+    <w:p/>
+    <w:p>
+      <w:r>
+        <w:drawing>
+          <wp:inline xmlns:a="http://schemas.openxmlformats.org/drawingml/2006/main" xmlns:pic="http://schemas.openxmlformats.org/drawingml/2006/picture">
+            <wp:extent cx="4114800" cy="2069455"/>
+            <wp:docPr id="3" name="Picture 3"/>
+            <wp:cNvGraphicFramePr>
+              <a:graphicFrameLocks noChangeAspect="1"/>
+            </wp:cNvGraphicFramePr>
+            <a:graphic>
+              <a:graphicData uri="http://schemas.openxmlformats.org/drawingml/2006/picture">
+                <pic:pic>
+                  <pic:nvPicPr>
+                    <pic:cNvPr id="0" name="line_ids_sheet.png"/>
+                    <pic:cNvPicPr/>
+                  </pic:nvPicPr>
+                  <pic:blipFill>
+                    <a:blip r:embed="rId11"/>
+                    <a:stretch>
+                      <a:fillRect/>
+                    </a:stretch>
+                  </pic:blipFill>
+                  <pic:spPr>
+                    <a:xfrm>
+                      <a:off x="0" y="0"/>
+                      <a:ext cx="4114800" cy="2069455"/>
+                    </a:xfrm>
+                    <a:prstGeom prst="rect"/>
+                  </pic:spPr>
+                </pic:pic>
+              </a:graphicData>
+            </a:graphic>
+          </wp:inline>
+        </w:drawing>
+      </w:r>
+    </w:p>
+    <w:p>
+      <w:pPr>
+        <w:jc w:val="center"/>
+      </w:pPr>
+      <w:r>
+        <w:rPr>
+          <w:i/>
+          <w:color w:val="505050"/>
+          <w:sz w:val="18"/>
+        </w:rPr>
+        <w:t>รูปภาพ: ชีตตาราง LINE_IDs ที่ระบบดึงและเขียนบันทึกรหัสแชตพนักงานโดยอัตโนมัติ</w:t>
+      </w:r>
+    </w:p>
+    <w:p/>
     <w:p>
       <w:pPr>
         <w:pStyle w:val="Heading3"/>
@@ -1182,6 +1335,126 @@
         <w:t>3. ช่างคอมพิวเตอร์ยังสามารถเปิดดูบันทึกเหตุการณ์แบบเรียลไทม์ได้จากเมนู "ประวัติการเรียกใช้งาน" (Executions) บนแถบด้านซ้ายมือของหน้า Apps Script เพื่อดูประวัติการร้องขอแบบเจาะลึกได้อีกด้วยครับ</w:t>
       </w:r>
     </w:p>
+    <w:p/>
+    <w:p>
+      <w:r>
+        <w:drawing>
+          <wp:inline xmlns:a="http://schemas.openxmlformats.org/drawingml/2006/main" xmlns:pic="http://schemas.openxmlformats.org/drawingml/2006/picture">
+            <wp:extent cx="4114800" cy="1756023"/>
+            <wp:docPr id="4" name="Picture 4"/>
+            <wp:cNvGraphicFramePr>
+              <a:graphicFrameLocks noChangeAspect="1"/>
+            </wp:cNvGraphicFramePr>
+            <a:graphic>
+              <a:graphicData uri="http://schemas.openxmlformats.org/drawingml/2006/picture">
+                <pic:pic>
+                  <pic:nvPicPr>
+                    <pic:cNvPr id="0" name="execution_error.png"/>
+                    <pic:cNvPicPr/>
+                  </pic:nvPicPr>
+                  <pic:blipFill>
+                    <a:blip r:embed="rId12"/>
+                    <a:stretch>
+                      <a:fillRect/>
+                    </a:stretch>
+                  </pic:blipFill>
+                  <pic:spPr>
+                    <a:xfrm>
+                      <a:off x="0" y="0"/>
+                      <a:ext cx="4114800" cy="1756023"/>
+                    </a:xfrm>
+                    <a:prstGeom prst="rect"/>
+                  </pic:spPr>
+                </pic:pic>
+              </a:graphicData>
+            </a:graphic>
+          </wp:inline>
+        </w:drawing>
+      </w:r>
+    </w:p>
+    <w:p>
+      <w:pPr>
+        <w:jc w:val="center"/>
+      </w:pPr>
+      <w:r>
+        <w:rPr>
+          <w:i/>
+          <w:color w:val="505050"/>
+          <w:sz w:val="18"/>
+        </w:rPr>
+        <w:t>รูปภาพ: ตัวอย่างประวัติความผิดพลาดในหน้าการดำเนินการ (Executions) บน Apps Script</w:t>
+      </w:r>
+    </w:p>
+    <w:p/>
+    <w:p>
+      <w:r>
+        <w:br w:type="page"/>
+      </w:r>
+    </w:p>
+    <w:p>
+      <w:pPr>
+        <w:pStyle w:val="Heading2"/>
+      </w:pPr>
+      <w:r>
+        <w:t>ส่วนที่ 5: ผลการทดสอบและการแจ้งเตือนบน LINE OA ประสบความสำเร็จจริง</w:t>
+      </w:r>
+    </w:p>
+    <w:p>
+      <w:r>
+        <w:t>เมื่อทำการเชื่อมโยงข้อมูลทั้งในส่วนของ Google Sheet Web App และเปิดใช้งาน Webhook และกรอกรหัสแชตได้อย่างถูกต้องแล้ว เมื่อช่างทำการเบิกจ่ายอะไหล่ในคลัง รายการจะถูกบันทึกสำเร็จลงฐานข้อมูล Sheets พร้อมแจ้งเตือนส่ง Flex Message ตรงเข้ามือถือของทีมช่างได้ทันที:</w:t>
+      </w:r>
+    </w:p>
+    <w:p/>
+    <w:p>
+      <w:r>
+        <w:drawing>
+          <wp:inline xmlns:a="http://schemas.openxmlformats.org/drawingml/2006/main" xmlns:pic="http://schemas.openxmlformats.org/drawingml/2006/picture">
+            <wp:extent cx="4114800" cy="2712393"/>
+            <wp:docPr id="5" name="Picture 5"/>
+            <wp:cNvGraphicFramePr>
+              <a:graphicFrameLocks noChangeAspect="1"/>
+            </wp:cNvGraphicFramePr>
+            <a:graphic>
+              <a:graphicData uri="http://schemas.openxmlformats.org/drawingml/2006/picture">
+                <pic:pic>
+                  <pic:nvPicPr>
+                    <pic:cNvPr id="0" name="transaction_success.png"/>
+                    <pic:cNvPicPr/>
+                  </pic:nvPicPr>
+                  <pic:blipFill>
+                    <a:blip r:embed="rId13"/>
+                    <a:stretch>
+                      <a:fillRect/>
+                    </a:stretch>
+                  </pic:blipFill>
+                  <pic:spPr>
+                    <a:xfrm>
+                      <a:off x="0" y="0"/>
+                      <a:ext cx="4114800" cy="2712393"/>
+                    </a:xfrm>
+                    <a:prstGeom prst="rect"/>
+                  </pic:spPr>
+                </pic:pic>
+              </a:graphicData>
+            </a:graphic>
+          </wp:inline>
+        </w:drawing>
+      </w:r>
+    </w:p>
+    <w:p>
+      <w:pPr>
+        <w:jc w:val="center"/>
+      </w:pPr>
+      <w:r>
+        <w:rPr>
+          <w:i/>
+          <w:color w:val="505050"/>
+          <w:sz w:val="18"/>
+        </w:rPr>
+        <w:t>รูปภาพ: การแสดงผลธุรกรรมและการยิงการ์ดแจ้งเตือน Flex Message บนหน้าจอมือถือ</w:t>
+      </w:r>
+    </w:p>
+    <w:p/>
     <w:sectPr>
       <w:pgSz w:w="12240" w:h="15840"/>
       <w:pgMar w:top="1440" w:right="1440" w:bottom="1440" w:left="1440" w:header="720" w:footer="720" w:gutter="0"/>

</xml_diff>

<commit_message>
V3: เคลีย mock data + ฟอร์ม PM + ย้าย LINE token ไป server-side
- รีเซ็ต inStock=0 ทุกอะไหล่, ล้าง transactions/PM plans (เริ่มใช้งานจริง)
- เพิ่ม data version gate ล้าง localStorage เก่าอัตโนมัติ
- ฟอร์มตั้งแผน PM (เพิ่ม/แก้ไข/ลบ) พร้อม placeholder ชี้นำ
- ย้าย LINE token จาก client (app.js) ไปฝั่ง GAS server-side
- เอา code.gs (มี secret) ออกจาก repo + เพิ่ม .gitignore กัน token leak

Co-Authored-By: Claude Opus 4.8 <noreply@anthropic.com>
</commit_message>
<xml_diff>
--- a/user_manual.docx
+++ b/user_manual.docx
@@ -157,7 +157,7 @@
           </w:tcPr>
           <w:p>
             <w:r>
-              <w:t>ระดับ 1: Programmer</w:t>
+              <w:t>ระดับ 1: Admin</w:t>
             </w:r>
           </w:p>
         </w:tc>
@@ -571,7 +571,7 @@
     </w:p>
     <w:p>
       <w:r>
-        <w:t>#### 1. Programmer (สิทธิ์ผู้สร้างระบบ)</w:t>
+        <w:t>#### 1. Admin (สิทธิ์ผู้สร้างระบบ)</w:t>
       </w:r>
     </w:p>
     <w:p>
@@ -611,7 +611,7 @@
         <w:pStyle w:val="ListBullet"/>
       </w:pPr>
       <w:r>
-        <w:t>รหัสผ่านเริ่มแรกในการเปิดระบบคือ `NKP-programmer-2026`</w:t>
+        <w:t>รหัสผ่านเริ่มแรกในการเปิดระบบคือ `NKP-admin-2026`</w:t>
       </w:r>
     </w:p>
     <w:p>
@@ -770,7 +770,7 @@
         <w:pStyle w:val="Heading3"/>
       </w:pPr>
       <w:r>
-        <w:t>2. คลังอะไหล่และอุปกรณ์ (Catalog) - เฉพาะสิทธิ์ Programmer และ Stock Manager</w:t>
+        <w:t>2. คลังอะไหล่และอุปกรณ์ (Catalog) - เฉพาะสิทธิ์ Admin และ Stock Manager</w:t>
       </w:r>
     </w:p>
     <w:p>
@@ -978,7 +978,7 @@
         <w:pStyle w:val="Heading3"/>
       </w:pPr>
       <w:r>
-        <w:t>5. ใบขอจัดซื้ออะไหล่ (Purchase Request Generator) - เฉพาะสิทธิ์ Programmer และ Stock Manager</w:t>
+        <w:t>5. ใบขอจัดซื้ออะไหล่ (Purchase Request Generator) - เฉพาะสิทธิ์ Admin และ Stock Manager</w:t>
       </w:r>
     </w:p>
     <w:p>
@@ -1063,7 +1063,7 @@
     </w:p>
     <w:p>
       <w:r>
-        <w:t>1. ล็อกอินเข้าระบบด้วยสิทธิ์ Programmer (รหัสผ่านเริ่มแรกคือ `NKP-programmer-2026`)</w:t>
+        <w:t>1. ล็อกอินเข้าระบบด้วยสิทธิ์ Admin (รหัสผ่านเริ่มแรกคือ `NKP-admin-2026`)</w:t>
       </w:r>
     </w:p>
     <w:p>

</xml_diff>